<commit_message>
Mise à jour des cartes suite au test
</commit_message>
<xml_diff>
--- a/docs/Presentation-cartes-a-jouer.docx
+++ b/docs/Presentation-cartes-a-jouer.docx
@@ -17,16 +17,16 @@
         </w:tblBorders>
         <w:tblCellMar>
           <w:top w:w="28" w:type="dxa"/>
-          <w:left w:w="28" w:type="dxa"/>
+          <w:left w:w="70" w:type="dxa"/>
           <w:bottom w:w="28" w:type="dxa"/>
-          <w:right w:w="28" w:type="dxa"/>
+          <w:right w:w="70" w:type="dxa"/>
         </w:tblCellMar>
         <w:tblLook w:val="04A0" w:firstRow="1" w:lastRow="0" w:firstColumn="1" w:lastColumn="0" w:noHBand="0" w:noVBand="1"/>
       </w:tblPr>
       <w:tblGrid>
-        <w:gridCol w:w="2637"/>
-        <w:gridCol w:w="2640"/>
-        <w:gridCol w:w="2459"/>
+        <w:gridCol w:w="2768"/>
+        <w:gridCol w:w="2772"/>
+        <w:gridCol w:w="2540"/>
         <w:gridCol w:w="2556"/>
       </w:tblGrid>
       <w:tr>
@@ -35,7 +35,7 @@
         </w:trPr>
         <w:tc>
           <w:tcPr>
-            <w:tcW w:w="0" w:type="auto"/>
+            <w:tcW w:w="4915" w:type="dxa"/>
             <w:gridSpan w:val="2"/>
             <w:vAlign w:val="center"/>
           </w:tcPr>
@@ -44,11 +44,20 @@
               <w:jc w:val="center"/>
             </w:pPr>
             <w:r>
+              <w:rPr>
+                <w:noProof/>
+              </w:rPr>
               <w:drawing>
-                <wp:inline distT="0" distB="0" distL="0" distR="0" wp14:anchorId="589CBC21" wp14:editId="0FEA2611">
-                  <wp:extent cx="3315600" cy="2678400"/>
-                  <wp:effectExtent l="0" t="0" r="0" b="8255"/>
-                  <wp:docPr id="735644610" name="Image 1"/>
+                <wp:inline distT="0" distB="0" distL="0" distR="0" wp14:anchorId="09A3CA98" wp14:editId="6B9FE589">
+                  <wp:extent cx="3429000" cy="2676525"/>
+                  <wp:effectExtent l="0" t="0" r="0" b="9525"/>
+                  <wp:docPr id="3" name="Image 2">
+                    <a:extLst xmlns:a="http://schemas.openxmlformats.org/drawingml/2006/main">
+                      <a:ext uri="{FF2B5EF4-FFF2-40B4-BE49-F238E27FC236}">
+                        <a16:creationId xmlns:a16="http://schemas.microsoft.com/office/drawing/2014/main" id="{48039A9E-6179-1E36-EF38-9DE6D2EAFBCE}"/>
+                      </a:ext>
+                    </a:extLst>
+                  </wp:docPr>
                   <wp:cNvGraphicFramePr>
                     <a:graphicFrameLocks xmlns:a="http://schemas.openxmlformats.org/drawingml/2006/main" noChangeAspect="1"/>
                   </wp:cNvGraphicFramePr>
@@ -56,7 +65,13 @@
                     <a:graphicData uri="http://schemas.openxmlformats.org/drawingml/2006/picture">
                       <pic:pic xmlns:pic="http://schemas.openxmlformats.org/drawingml/2006/picture">
                         <pic:nvPicPr>
-                          <pic:cNvPr id="0" name="Picture 1"/>
+                          <pic:cNvPr id="3" name="Image 2">
+                            <a:extLst>
+                              <a:ext uri="{FF2B5EF4-FFF2-40B4-BE49-F238E27FC236}">
+                                <a16:creationId xmlns:a16="http://schemas.microsoft.com/office/drawing/2014/main" id="{48039A9E-6179-1E36-EF38-9DE6D2EAFBCE}"/>
+                              </a:ext>
+                            </a:extLst>
+                          </pic:cNvPr>
                           <pic:cNvPicPr>
                             <a:picLocks noChangeAspect="1" noChangeArrowheads="1"/>
                           </pic:cNvPicPr>
@@ -77,15 +92,21 @@
                         <pic:spPr bwMode="auto">
                           <a:xfrm>
                             <a:off x="0" y="0"/>
-                            <a:ext cx="3315600" cy="2678400"/>
+                            <a:ext cx="3429000" cy="2676525"/>
                           </a:xfrm>
                           <a:prstGeom prst="rect">
                             <a:avLst/>
                           </a:prstGeom>
                           <a:noFill/>
-                          <a:ln>
-                            <a:noFill/>
-                          </a:ln>
+                          <a:extLst>
+                            <a:ext uri="{909E8E84-426E-40DD-AFC4-6F175D3DCCD1}">
+                              <a14:hiddenFill xmlns:a14="http://schemas.microsoft.com/office/drawing/2010/main">
+                                <a:solidFill>
+                                  <a:srgbClr val="FFFFFF"/>
+                                </a:solidFill>
+                              </a14:hiddenFill>
+                            </a:ext>
+                          </a:extLst>
                         </pic:spPr>
                       </pic:pic>
                     </a:graphicData>
@@ -97,7 +118,7 @@
         </w:tc>
         <w:tc>
           <w:tcPr>
-            <w:tcW w:w="0" w:type="auto"/>
+            <w:tcW w:w="2459" w:type="dxa"/>
             <w:vAlign w:val="center"/>
           </w:tcPr>
           <w:p>
@@ -109,7 +130,7 @@
                 <w:noProof/>
               </w:rPr>
               <w:drawing>
-                <wp:inline distT="0" distB="0" distL="0" distR="0" wp14:anchorId="77DB6956" wp14:editId="3764FEC8">
+                <wp:inline distT="0" distB="0" distL="0" distR="0" wp14:anchorId="77DB6956" wp14:editId="7C484A60">
                   <wp:extent cx="1515600" cy="2329200"/>
                   <wp:effectExtent l="0" t="0" r="8890" b="0"/>
                   <wp:docPr id="1207511069" name="Image 1" descr="Une image contenant texte, dessin humoristique, capture d’écran&#10;&#10;Le contenu généré par l’IA peut être incorrect.">
@@ -168,7 +189,7 @@
         </w:tc>
         <w:tc>
           <w:tcPr>
-            <w:tcW w:w="0" w:type="auto"/>
+            <w:tcW w:w="2556" w:type="dxa"/>
             <w:vAlign w:val="center"/>
           </w:tcPr>
           <w:p>
@@ -229,6 +250,12 @@
         </w:tc>
       </w:tr>
       <w:tr>
+        <w:tblPrEx>
+          <w:tblCellMar>
+            <w:left w:w="28" w:type="dxa"/>
+            <w:right w:w="28" w:type="dxa"/>
+          </w:tblCellMar>
+        </w:tblPrEx>
         <w:trPr>
           <w:jc w:val="center"/>
         </w:trPr>
@@ -518,6 +545,12 @@
         </w:tc>
       </w:tr>
       <w:tr>
+        <w:tblPrEx>
+          <w:tblCellMar>
+            <w:left w:w="28" w:type="dxa"/>
+            <w:right w:w="28" w:type="dxa"/>
+          </w:tblCellMar>
+        </w:tblPrEx>
         <w:trPr>
           <w:jc w:val="center"/>
         </w:trPr>
@@ -807,6 +840,12 @@
         </w:tc>
       </w:tr>
       <w:tr>
+        <w:tblPrEx>
+          <w:tblCellMar>
+            <w:left w:w="28" w:type="dxa"/>
+            <w:right w:w="28" w:type="dxa"/>
+          </w:tblCellMar>
+        </w:tblPrEx>
         <w:trPr>
           <w:jc w:val="center"/>
         </w:trPr>
@@ -966,13 +1005,13 @@
                 <w:noProof/>
               </w:rPr>
               <w:drawing>
-                <wp:inline distT="0" distB="0" distL="0" distR="0" wp14:anchorId="7126D2F6" wp14:editId="797826D1">
+                <wp:inline distT="0" distB="0" distL="0" distR="0" wp14:anchorId="34FCCC42" wp14:editId="7C8A7C68">
                   <wp:extent cx="1497600" cy="2332800"/>
                   <wp:effectExtent l="0" t="0" r="7620" b="0"/>
-                  <wp:docPr id="733905738" name="Image 1" descr="Une image contenant texte, affiche, Visage humain, capture d’écran&#10;&#10;Le contenu généré par l’IA peut être incorrect.">
+                  <wp:docPr id="332344493" name="Image 1">
                     <a:extLst xmlns:a="http://schemas.openxmlformats.org/drawingml/2006/main">
                       <a:ext uri="{FF2B5EF4-FFF2-40B4-BE49-F238E27FC236}">
-                        <a16:creationId xmlns:a16="http://schemas.microsoft.com/office/drawing/2014/main" id="{B66634A6-5829-7730-66CE-1EEB0BAB874B}"/>
+                        <a16:creationId xmlns:a16="http://schemas.microsoft.com/office/drawing/2014/main" id="{A6EFCA0A-AC95-635C-77A2-8142C819DCB1}"/>
                       </a:ext>
                     </a:extLst>
                   </wp:docPr>
@@ -983,10 +1022,10 @@
                     <a:graphicData uri="http://schemas.openxmlformats.org/drawingml/2006/picture">
                       <pic:pic xmlns:pic="http://schemas.openxmlformats.org/drawingml/2006/picture">
                         <pic:nvPicPr>
-                          <pic:cNvPr id="733905738" name="Image 1" descr="Une image contenant texte, affiche, Visage humain, capture d’écran&#10;&#10;Le contenu généré par l’IA peut être incorrect.">
+                          <pic:cNvPr id="332344493" name="Image 332344493">
                             <a:extLst>
                               <a:ext uri="{FF2B5EF4-FFF2-40B4-BE49-F238E27FC236}">
-                                <a16:creationId xmlns:a16="http://schemas.microsoft.com/office/drawing/2014/main" id="{B66634A6-5829-7730-66CE-1EEB0BAB874B}"/>
+                                <a16:creationId xmlns:a16="http://schemas.microsoft.com/office/drawing/2014/main" id="{A6EFCA0A-AC95-635C-77A2-8142C819DCB1}"/>
                               </a:ext>
                             </a:extLst>
                           </pic:cNvPr>

</xml_diff>

<commit_message>
Retouche graphique de Complot à la Cour
</commit_message>
<xml_diff>
--- a/docs/Presentation-cartes-a-jouer.docx
+++ b/docs/Presentation-cartes-a-jouer.docx
@@ -1001,17 +1001,14 @@
               <w:jc w:val="center"/>
             </w:pPr>
             <w:r>
-              <w:rPr>
-                <w:noProof/>
-              </w:rPr>
               <w:drawing>
-                <wp:inline distT="0" distB="0" distL="0" distR="0" wp14:anchorId="34FCCC42" wp14:editId="7C8A7C68">
+                <wp:inline distT="0" distB="0" distL="0" distR="0" wp14:anchorId="6888B107" wp14:editId="76986705">
                   <wp:extent cx="1497600" cy="2332800"/>
                   <wp:effectExtent l="0" t="0" r="7620" b="0"/>
-                  <wp:docPr id="332344493" name="Image 1">
+                  <wp:docPr id="41" name="Image 40">
                     <a:extLst xmlns:a="http://schemas.openxmlformats.org/drawingml/2006/main">
                       <a:ext uri="{FF2B5EF4-FFF2-40B4-BE49-F238E27FC236}">
-                        <a16:creationId xmlns:a16="http://schemas.microsoft.com/office/drawing/2014/main" id="{A6EFCA0A-AC95-635C-77A2-8142C819DCB1}"/>
+                        <a16:creationId xmlns:a16="http://schemas.microsoft.com/office/drawing/2014/main" id="{BD08F4DC-FC84-8656-9F70-B7FE300020C9}"/>
                       </a:ext>
                     </a:extLst>
                   </wp:docPr>
@@ -1022,10 +1019,10 @@
                     <a:graphicData uri="http://schemas.openxmlformats.org/drawingml/2006/picture">
                       <pic:pic xmlns:pic="http://schemas.openxmlformats.org/drawingml/2006/picture">
                         <pic:nvPicPr>
-                          <pic:cNvPr id="332344493" name="Image 332344493">
+                          <pic:cNvPr id="41" name="Image 40">
                             <a:extLst>
                               <a:ext uri="{FF2B5EF4-FFF2-40B4-BE49-F238E27FC236}">
-                                <a16:creationId xmlns:a16="http://schemas.microsoft.com/office/drawing/2014/main" id="{A6EFCA0A-AC95-635C-77A2-8142C819DCB1}"/>
+                                <a16:creationId xmlns:a16="http://schemas.microsoft.com/office/drawing/2014/main" id="{BD08F4DC-FC84-8656-9F70-B7FE300020C9}"/>
                               </a:ext>
                             </a:extLst>
                           </pic:cNvPr>
@@ -1034,13 +1031,7 @@
                           </pic:cNvPicPr>
                         </pic:nvPicPr>
                         <pic:blipFill>
-                          <a:blip r:embed="rId18">
-                            <a:extLst>
-                              <a:ext uri="{28A0092B-C50C-407E-A947-70E740481C1C}">
-                                <a14:useLocalDpi xmlns:a14="http://schemas.microsoft.com/office/drawing/2010/main" val="0"/>
-                              </a:ext>
-                            </a:extLst>
-                          </a:blip>
+                          <a:blip r:embed="rId18"/>
                           <a:stretch>
                             <a:fillRect/>
                           </a:stretch>
@@ -1689,7 +1680,6 @@
   <w:style w:type="character" w:default="1" w:styleId="Policepardfaut">
     <w:name w:val="Default Paragraph Font"/>
     <w:uiPriority w:val="1"/>
-    <w:semiHidden/>
     <w:unhideWhenUsed/>
   </w:style>
   <w:style w:type="table" w:default="1" w:styleId="TableauNormal">

</xml_diff>

<commit_message>
Mise à jour de la présentation des cartes avec les icônes tuiles de commandement
</commit_message>
<xml_diff>
--- a/docs/Presentation-cartes-a-jouer.docx
+++ b/docs/Presentation-cartes-a-jouer.docx
@@ -24,8 +24,8 @@
         <w:tblLook w:val="04A0" w:firstRow="1" w:lastRow="0" w:firstColumn="1" w:lastColumn="0" w:noHBand="0" w:noVBand="1"/>
       </w:tblPr>
       <w:tblGrid>
-        <w:gridCol w:w="2768"/>
-        <w:gridCol w:w="2772"/>
+        <w:gridCol w:w="2770"/>
+        <w:gridCol w:w="2770"/>
         <w:gridCol w:w="2540"/>
         <w:gridCol w:w="2556"/>
       </w:tblGrid>
@@ -126,17 +126,14 @@
               <w:jc w:val="center"/>
             </w:pPr>
             <w:r>
-              <w:rPr>
-                <w:noProof/>
-              </w:rPr>
               <w:drawing>
-                <wp:inline distT="0" distB="0" distL="0" distR="0" wp14:anchorId="77DB6956" wp14:editId="7C484A60">
-                  <wp:extent cx="1515600" cy="2329200"/>
+                <wp:inline distT="0" distB="0" distL="0" distR="0" wp14:anchorId="5521E76B" wp14:editId="092BF319">
+                  <wp:extent cx="1515600" cy="2332800"/>
                   <wp:effectExtent l="0" t="0" r="8890" b="0"/>
-                  <wp:docPr id="1207511069" name="Image 1" descr="Une image contenant texte, dessin humoristique, capture d’écran&#10;&#10;Le contenu généré par l’IA peut être incorrect.">
+                  <wp:docPr id="2" name="Image 1">
                     <a:extLst xmlns:a="http://schemas.openxmlformats.org/drawingml/2006/main">
                       <a:ext uri="{FF2B5EF4-FFF2-40B4-BE49-F238E27FC236}">
-                        <a16:creationId xmlns:a16="http://schemas.microsoft.com/office/drawing/2014/main" id="{9685C404-5EDD-6B83-B779-38498A37108F}"/>
+                        <a16:creationId xmlns:a16="http://schemas.microsoft.com/office/drawing/2014/main" id="{A0C65CD5-B285-9246-B8CB-F06F031991AC}"/>
                       </a:ext>
                     </a:extLst>
                   </wp:docPr>
@@ -147,10 +144,10 @@
                     <a:graphicData uri="http://schemas.openxmlformats.org/drawingml/2006/picture">
                       <pic:pic xmlns:pic="http://schemas.openxmlformats.org/drawingml/2006/picture">
                         <pic:nvPicPr>
-                          <pic:cNvPr id="1207511069" name="Image 1" descr="Une image contenant texte, dessin humoristique, capture d’écran&#10;&#10;Le contenu généré par l’IA peut être incorrect.">
+                          <pic:cNvPr id="2" name="Image 1">
                             <a:extLst>
                               <a:ext uri="{FF2B5EF4-FFF2-40B4-BE49-F238E27FC236}">
-                                <a16:creationId xmlns:a16="http://schemas.microsoft.com/office/drawing/2014/main" id="{9685C404-5EDD-6B83-B779-38498A37108F}"/>
+                                <a16:creationId xmlns:a16="http://schemas.microsoft.com/office/drawing/2014/main" id="{A0C65CD5-B285-9246-B8CB-F06F031991AC}"/>
                               </a:ext>
                             </a:extLst>
                           </pic:cNvPr>
@@ -159,13 +156,7 @@
                           </pic:cNvPicPr>
                         </pic:nvPicPr>
                         <pic:blipFill>
-                          <a:blip r:embed="rId6">
-                            <a:extLst>
-                              <a:ext uri="{28A0092B-C50C-407E-A947-70E740481C1C}">
-                                <a14:useLocalDpi xmlns:a14="http://schemas.microsoft.com/office/drawing/2010/main" val="0"/>
-                              </a:ext>
-                            </a:extLst>
-                          </a:blip>
+                          <a:blip r:embed="rId6"/>
                           <a:stretch>
                             <a:fillRect/>
                           </a:stretch>
@@ -173,7 +164,7 @@
                         <pic:spPr>
                           <a:xfrm>
                             <a:off x="0" y="0"/>
-                            <a:ext cx="1515600" cy="2329200"/>
+                            <a:ext cx="1515600" cy="2332800"/>
                           </a:xfrm>
                           <a:prstGeom prst="rect">
                             <a:avLst/>
@@ -197,89 +188,14 @@
               <w:jc w:val="center"/>
             </w:pPr>
             <w:r>
-              <w:rPr>
-                <w:noProof/>
-              </w:rPr>
               <w:drawing>
-                <wp:inline distT="0" distB="0" distL="0" distR="0" wp14:anchorId="5883182C" wp14:editId="38434386">
+                <wp:inline distT="0" distB="0" distL="0" distR="0" wp14:anchorId="06FBE480" wp14:editId="30E8740C">
                   <wp:extent cx="1515600" cy="2332800"/>
                   <wp:effectExtent l="0" t="0" r="8890" b="0"/>
-                  <wp:docPr id="1056031934" name="Image 2"/>
-                  <wp:cNvGraphicFramePr>
-                    <a:graphicFrameLocks xmlns:a="http://schemas.openxmlformats.org/drawingml/2006/main" noChangeAspect="1"/>
-                  </wp:cNvGraphicFramePr>
-                  <a:graphic xmlns:a="http://schemas.openxmlformats.org/drawingml/2006/main">
-                    <a:graphicData uri="http://schemas.openxmlformats.org/drawingml/2006/picture">
-                      <pic:pic xmlns:pic="http://schemas.openxmlformats.org/drawingml/2006/picture">
-                        <pic:nvPicPr>
-                          <pic:cNvPr id="0" name="Picture 2"/>
-                          <pic:cNvPicPr>
-                            <a:picLocks noChangeAspect="1" noChangeArrowheads="1"/>
-                          </pic:cNvPicPr>
-                        </pic:nvPicPr>
-                        <pic:blipFill>
-                          <a:blip r:embed="rId7">
-                            <a:extLst>
-                              <a:ext uri="{28A0092B-C50C-407E-A947-70E740481C1C}">
-                                <a14:useLocalDpi xmlns:a14="http://schemas.microsoft.com/office/drawing/2010/main" val="0"/>
-                              </a:ext>
-                            </a:extLst>
-                          </a:blip>
-                          <a:srcRect/>
-                          <a:stretch>
-                            <a:fillRect/>
-                          </a:stretch>
-                        </pic:blipFill>
-                        <pic:spPr bwMode="auto">
-                          <a:xfrm>
-                            <a:off x="0" y="0"/>
-                            <a:ext cx="1515600" cy="2332800"/>
-                          </a:xfrm>
-                          <a:prstGeom prst="rect">
-                            <a:avLst/>
-                          </a:prstGeom>
-                          <a:noFill/>
-                        </pic:spPr>
-                      </pic:pic>
-                    </a:graphicData>
-                  </a:graphic>
-                </wp:inline>
-              </w:drawing>
-            </w:r>
-          </w:p>
-        </w:tc>
-      </w:tr>
-      <w:tr>
-        <w:tblPrEx>
-          <w:tblCellMar>
-            <w:left w:w="28" w:type="dxa"/>
-            <w:right w:w="28" w:type="dxa"/>
-          </w:tblCellMar>
-        </w:tblPrEx>
-        <w:trPr>
-          <w:jc w:val="center"/>
-        </w:trPr>
-        <w:tc>
-          <w:tcPr>
-            <w:tcW w:w="0" w:type="auto"/>
-            <w:vAlign w:val="center"/>
-          </w:tcPr>
-          <w:p>
-            <w:pPr>
-              <w:jc w:val="center"/>
-            </w:pPr>
-            <w:r>
-              <w:rPr>
-                <w:noProof/>
-              </w:rPr>
-              <w:drawing>
-                <wp:inline distT="0" distB="0" distL="0" distR="0" wp14:anchorId="60673BD2" wp14:editId="736ECDB7">
-                  <wp:extent cx="1515600" cy="2332800"/>
-                  <wp:effectExtent l="0" t="0" r="8890" b="0"/>
-                  <wp:docPr id="1989256351" name="Image 1" descr="Une image contenant texte, dessin humoristique, capture d’écran&#10;&#10;Le contenu généré par l’IA peut être incorrect.">
+                  <wp:docPr id="1716030872" name="Image 2">
                     <a:extLst xmlns:a="http://schemas.openxmlformats.org/drawingml/2006/main">
                       <a:ext uri="{FF2B5EF4-FFF2-40B4-BE49-F238E27FC236}">
-                        <a16:creationId xmlns:a16="http://schemas.microsoft.com/office/drawing/2014/main" id="{17057F21-6848-62C2-09C9-184A1A05ABCD}"/>
+                        <a16:creationId xmlns:a16="http://schemas.microsoft.com/office/drawing/2014/main" id="{11FA7AF5-B392-6B29-7909-25EA78610919}"/>
                       </a:ext>
                     </a:extLst>
                   </wp:docPr>
@@ -290,10 +206,10 @@
                     <a:graphicData uri="http://schemas.openxmlformats.org/drawingml/2006/picture">
                       <pic:pic xmlns:pic="http://schemas.openxmlformats.org/drawingml/2006/picture">
                         <pic:nvPicPr>
-                          <pic:cNvPr id="1989256351" name="Image 1" descr="Une image contenant texte, dessin humoristique, capture d’écran&#10;&#10;Le contenu généré par l’IA peut être incorrect.">
+                          <pic:cNvPr id="3" name="Image 2">
                             <a:extLst>
                               <a:ext uri="{FF2B5EF4-FFF2-40B4-BE49-F238E27FC236}">
-                                <a16:creationId xmlns:a16="http://schemas.microsoft.com/office/drawing/2014/main" id="{17057F21-6848-62C2-09C9-184A1A05ABCD}"/>
+                                <a16:creationId xmlns:a16="http://schemas.microsoft.com/office/drawing/2014/main" id="{11FA7AF5-B392-6B29-7909-25EA78610919}"/>
                               </a:ext>
                             </a:extLst>
                           </pic:cNvPr>
@@ -302,13 +218,7 @@
                           </pic:cNvPicPr>
                         </pic:nvPicPr>
                         <pic:blipFill>
-                          <a:blip r:embed="rId8">
-                            <a:extLst>
-                              <a:ext uri="{28A0092B-C50C-407E-A947-70E740481C1C}">
-                                <a14:useLocalDpi xmlns:a14="http://schemas.microsoft.com/office/drawing/2010/main" val="0"/>
-                              </a:ext>
-                            </a:extLst>
-                          </a:blip>
+                          <a:blip r:embed="rId7"/>
                           <a:stretch>
                             <a:fillRect/>
                           </a:stretch>
@@ -317,219 +227,6 @@
                           <a:xfrm>
                             <a:off x="0" y="0"/>
                             <a:ext cx="1515600" cy="2332800"/>
-                          </a:xfrm>
-                          <a:prstGeom prst="rect">
-                            <a:avLst/>
-                          </a:prstGeom>
-                        </pic:spPr>
-                      </pic:pic>
-                    </a:graphicData>
-                  </a:graphic>
-                </wp:inline>
-              </w:drawing>
-            </w:r>
-          </w:p>
-        </w:tc>
-        <w:tc>
-          <w:tcPr>
-            <w:tcW w:w="0" w:type="auto"/>
-            <w:vAlign w:val="center"/>
-          </w:tcPr>
-          <w:p>
-            <w:pPr>
-              <w:jc w:val="center"/>
-            </w:pPr>
-            <w:r>
-              <w:rPr>
-                <w:noProof/>
-              </w:rPr>
-              <w:drawing>
-                <wp:inline distT="0" distB="0" distL="0" distR="0" wp14:anchorId="364884AD" wp14:editId="17169FDD">
-                  <wp:extent cx="1525905" cy="2339975"/>
-                  <wp:effectExtent l="0" t="0" r="0" b="3175"/>
-                  <wp:docPr id="117780658" name="Image 1" descr="Une image contenant texte, capture d’écran, Police, cercle&#10;&#10;Le contenu généré par l’IA peut être incorrect.">
-                    <a:extLst xmlns:a="http://schemas.openxmlformats.org/drawingml/2006/main">
-                      <a:ext uri="{FF2B5EF4-FFF2-40B4-BE49-F238E27FC236}">
-                        <a16:creationId xmlns:a16="http://schemas.microsoft.com/office/drawing/2014/main" id="{97464052-43FD-556E-FBD0-D3FE8F87CEE5}"/>
-                      </a:ext>
-                    </a:extLst>
-                  </wp:docPr>
-                  <wp:cNvGraphicFramePr>
-                    <a:graphicFrameLocks xmlns:a="http://schemas.openxmlformats.org/drawingml/2006/main" noChangeAspect="1"/>
-                  </wp:cNvGraphicFramePr>
-                  <a:graphic xmlns:a="http://schemas.openxmlformats.org/drawingml/2006/main">
-                    <a:graphicData uri="http://schemas.openxmlformats.org/drawingml/2006/picture">
-                      <pic:pic xmlns:pic="http://schemas.openxmlformats.org/drawingml/2006/picture">
-                        <pic:nvPicPr>
-                          <pic:cNvPr id="117780658" name="Image 1" descr="Une image contenant texte, capture d’écran, Police, cercle&#10;&#10;Le contenu généré par l’IA peut être incorrect.">
-                            <a:extLst>
-                              <a:ext uri="{FF2B5EF4-FFF2-40B4-BE49-F238E27FC236}">
-                                <a16:creationId xmlns:a16="http://schemas.microsoft.com/office/drawing/2014/main" id="{97464052-43FD-556E-FBD0-D3FE8F87CEE5}"/>
-                              </a:ext>
-                            </a:extLst>
-                          </pic:cNvPr>
-                          <pic:cNvPicPr>
-                            <a:picLocks noChangeAspect="1"/>
-                          </pic:cNvPicPr>
-                        </pic:nvPicPr>
-                        <pic:blipFill>
-                          <a:blip r:embed="rId9">
-                            <a:extLst>
-                              <a:ext uri="{28A0092B-C50C-407E-A947-70E740481C1C}">
-                                <a14:useLocalDpi xmlns:a14="http://schemas.microsoft.com/office/drawing/2010/main" val="0"/>
-                              </a:ext>
-                            </a:extLst>
-                          </a:blip>
-                          <a:stretch>
-                            <a:fillRect/>
-                          </a:stretch>
-                        </pic:blipFill>
-                        <pic:spPr>
-                          <a:xfrm>
-                            <a:off x="0" y="0"/>
-                            <a:ext cx="1525905" cy="2339975"/>
-                          </a:xfrm>
-                          <a:prstGeom prst="rect">
-                            <a:avLst/>
-                          </a:prstGeom>
-                        </pic:spPr>
-                      </pic:pic>
-                    </a:graphicData>
-                  </a:graphic>
-                </wp:inline>
-              </w:drawing>
-            </w:r>
-          </w:p>
-        </w:tc>
-        <w:tc>
-          <w:tcPr>
-            <w:tcW w:w="0" w:type="auto"/>
-            <w:vAlign w:val="center"/>
-          </w:tcPr>
-          <w:p>
-            <w:pPr>
-              <w:jc w:val="center"/>
-            </w:pPr>
-            <w:r>
-              <w:rPr>
-                <w:noProof/>
-              </w:rPr>
-              <w:drawing>
-                <wp:inline distT="0" distB="0" distL="0" distR="0" wp14:anchorId="527DFB5F" wp14:editId="4621517E">
-                  <wp:extent cx="1526400" cy="2332800"/>
-                  <wp:effectExtent l="0" t="0" r="0" b="0"/>
-                  <wp:docPr id="2134995951" name="Image 1" descr="Une image contenant texte, capture d’écran, Police, cercle&#10;&#10;Le contenu généré par l’IA peut être incorrect.">
-                    <a:extLst xmlns:a="http://schemas.openxmlformats.org/drawingml/2006/main">
-                      <a:ext uri="{FF2B5EF4-FFF2-40B4-BE49-F238E27FC236}">
-                        <a16:creationId xmlns:a16="http://schemas.microsoft.com/office/drawing/2014/main" id="{798011AE-41FD-07A7-37CE-C7989C433903}"/>
-                      </a:ext>
-                    </a:extLst>
-                  </wp:docPr>
-                  <wp:cNvGraphicFramePr>
-                    <a:graphicFrameLocks xmlns:a="http://schemas.openxmlformats.org/drawingml/2006/main" noChangeAspect="1"/>
-                  </wp:cNvGraphicFramePr>
-                  <a:graphic xmlns:a="http://schemas.openxmlformats.org/drawingml/2006/main">
-                    <a:graphicData uri="http://schemas.openxmlformats.org/drawingml/2006/picture">
-                      <pic:pic xmlns:pic="http://schemas.openxmlformats.org/drawingml/2006/picture">
-                        <pic:nvPicPr>
-                          <pic:cNvPr id="2134995951" name="Image 1" descr="Une image contenant texte, capture d’écran, Police, cercle&#10;&#10;Le contenu généré par l’IA peut être incorrect.">
-                            <a:extLst>
-                              <a:ext uri="{FF2B5EF4-FFF2-40B4-BE49-F238E27FC236}">
-                                <a16:creationId xmlns:a16="http://schemas.microsoft.com/office/drawing/2014/main" id="{798011AE-41FD-07A7-37CE-C7989C433903}"/>
-                              </a:ext>
-                            </a:extLst>
-                          </pic:cNvPr>
-                          <pic:cNvPicPr>
-                            <a:picLocks noChangeAspect="1"/>
-                          </pic:cNvPicPr>
-                        </pic:nvPicPr>
-                        <pic:blipFill>
-                          <a:blip r:embed="rId10">
-                            <a:extLst>
-                              <a:ext uri="{28A0092B-C50C-407E-A947-70E740481C1C}">
-                                <a14:useLocalDpi xmlns:a14="http://schemas.microsoft.com/office/drawing/2010/main" val="0"/>
-                              </a:ext>
-                            </a:extLst>
-                          </a:blip>
-                          <a:stretch>
-                            <a:fillRect/>
-                          </a:stretch>
-                        </pic:blipFill>
-                        <pic:spPr>
-                          <a:xfrm>
-                            <a:off x="0" y="0"/>
-                            <a:ext cx="1526400" cy="2332800"/>
-                          </a:xfrm>
-                          <a:prstGeom prst="rect">
-                            <a:avLst/>
-                          </a:prstGeom>
-                        </pic:spPr>
-                      </pic:pic>
-                    </a:graphicData>
-                  </a:graphic>
-                </wp:inline>
-              </w:drawing>
-            </w:r>
-          </w:p>
-        </w:tc>
-        <w:tc>
-          <w:tcPr>
-            <w:tcW w:w="0" w:type="auto"/>
-            <w:vAlign w:val="center"/>
-          </w:tcPr>
-          <w:p>
-            <w:pPr>
-              <w:jc w:val="center"/>
-            </w:pPr>
-            <w:r>
-              <w:rPr>
-                <w:noProof/>
-              </w:rPr>
-              <w:drawing>
-                <wp:inline distT="0" distB="0" distL="0" distR="0" wp14:anchorId="0FDF80E7" wp14:editId="0C60DC6A">
-                  <wp:extent cx="1525905" cy="2332355"/>
-                  <wp:effectExtent l="0" t="0" r="0" b="0"/>
-                  <wp:docPr id="278278724" name="Image 1" descr="Une image contenant texte, capture d’écran, Police, conception&#10;&#10;Le contenu généré par l’IA peut être incorrect.">
-                    <a:extLst xmlns:a="http://schemas.openxmlformats.org/drawingml/2006/main">
-                      <a:ext uri="{FF2B5EF4-FFF2-40B4-BE49-F238E27FC236}">
-                        <a16:creationId xmlns:a16="http://schemas.microsoft.com/office/drawing/2014/main" id="{F5D378A7-281C-0DFD-4D81-A3E6BD46FE33}"/>
-                      </a:ext>
-                    </a:extLst>
-                  </wp:docPr>
-                  <wp:cNvGraphicFramePr>
-                    <a:graphicFrameLocks xmlns:a="http://schemas.openxmlformats.org/drawingml/2006/main" noChangeAspect="1"/>
-                  </wp:cNvGraphicFramePr>
-                  <a:graphic xmlns:a="http://schemas.openxmlformats.org/drawingml/2006/main">
-                    <a:graphicData uri="http://schemas.openxmlformats.org/drawingml/2006/picture">
-                      <pic:pic xmlns:pic="http://schemas.openxmlformats.org/drawingml/2006/picture">
-                        <pic:nvPicPr>
-                          <pic:cNvPr id="278278724" name="Image 1" descr="Une image contenant texte, capture d’écran, Police, conception&#10;&#10;Le contenu généré par l’IA peut être incorrect.">
-                            <a:extLst>
-                              <a:ext uri="{FF2B5EF4-FFF2-40B4-BE49-F238E27FC236}">
-                                <a16:creationId xmlns:a16="http://schemas.microsoft.com/office/drawing/2014/main" id="{F5D378A7-281C-0DFD-4D81-A3E6BD46FE33}"/>
-                              </a:ext>
-                            </a:extLst>
-                          </pic:cNvPr>
-                          <pic:cNvPicPr>
-                            <a:picLocks noChangeAspect="1"/>
-                          </pic:cNvPicPr>
-                        </pic:nvPicPr>
-                        <pic:blipFill>
-                          <a:blip r:embed="rId11">
-                            <a:extLst>
-                              <a:ext uri="{28A0092B-C50C-407E-A947-70E740481C1C}">
-                                <a14:useLocalDpi xmlns:a14="http://schemas.microsoft.com/office/drawing/2010/main" val="0"/>
-                              </a:ext>
-                            </a:extLst>
-                          </a:blip>
-                          <a:stretch>
-                            <a:fillRect/>
-                          </a:stretch>
-                        </pic:blipFill>
-                        <pic:spPr>
-                          <a:xfrm>
-                            <a:off x="0" y="0"/>
-                            <a:ext cx="1525905" cy="2332355"/>
                           </a:xfrm>
                           <a:prstGeom prst="rect">
                             <a:avLst/>
@@ -564,17 +261,14 @@
               <w:jc w:val="center"/>
             </w:pPr>
             <w:r>
-              <w:rPr>
-                <w:noProof/>
-              </w:rPr>
               <w:drawing>
-                <wp:inline distT="0" distB="0" distL="0" distR="0" wp14:anchorId="1BF06B96" wp14:editId="715C14FC">
-                  <wp:extent cx="1501200" cy="2332800"/>
-                  <wp:effectExtent l="0" t="0" r="3810" b="0"/>
-                  <wp:docPr id="134036051" name="Image 1" descr="Une image contenant texte, capture d’écran, Police, livre&#10;&#10;Le contenu généré par l’IA peut être incorrect.">
+                <wp:inline distT="0" distB="0" distL="0" distR="0" wp14:anchorId="04898122" wp14:editId="1B69C154">
+                  <wp:extent cx="1515600" cy="2332800"/>
+                  <wp:effectExtent l="0" t="0" r="8890" b="0"/>
+                  <wp:docPr id="4" name="Image 3">
                     <a:extLst xmlns:a="http://schemas.openxmlformats.org/drawingml/2006/main">
                       <a:ext uri="{FF2B5EF4-FFF2-40B4-BE49-F238E27FC236}">
-                        <a16:creationId xmlns:a16="http://schemas.microsoft.com/office/drawing/2014/main" id="{E40809E7-6B9E-9BBE-493D-F20F3864D1B8}"/>
+                        <a16:creationId xmlns:a16="http://schemas.microsoft.com/office/drawing/2014/main" id="{0C3B7389-ECD8-12CE-2818-1777B1895F1C}"/>
                       </a:ext>
                     </a:extLst>
                   </wp:docPr>
@@ -585,10 +279,10 @@
                     <a:graphicData uri="http://schemas.openxmlformats.org/drawingml/2006/picture">
                       <pic:pic xmlns:pic="http://schemas.openxmlformats.org/drawingml/2006/picture">
                         <pic:nvPicPr>
-                          <pic:cNvPr id="134036051" name="Image 1" descr="Une image contenant texte, capture d’écran, Police, livre&#10;&#10;Le contenu généré par l’IA peut être incorrect.">
+                          <pic:cNvPr id="4" name="Image 3">
                             <a:extLst>
                               <a:ext uri="{FF2B5EF4-FFF2-40B4-BE49-F238E27FC236}">
-                                <a16:creationId xmlns:a16="http://schemas.microsoft.com/office/drawing/2014/main" id="{E40809E7-6B9E-9BBE-493D-F20F3864D1B8}"/>
+                                <a16:creationId xmlns:a16="http://schemas.microsoft.com/office/drawing/2014/main" id="{0C3B7389-ECD8-12CE-2818-1777B1895F1C}"/>
                               </a:ext>
                             </a:extLst>
                           </pic:cNvPr>
@@ -597,13 +291,328 @@
                           </pic:cNvPicPr>
                         </pic:nvPicPr>
                         <pic:blipFill>
-                          <a:blip r:embed="rId12">
+                          <a:blip r:embed="rId8"/>
+                          <a:stretch>
+                            <a:fillRect/>
+                          </a:stretch>
+                        </pic:blipFill>
+                        <pic:spPr>
+                          <a:xfrm>
+                            <a:off x="0" y="0"/>
+                            <a:ext cx="1515600" cy="2332800"/>
+                          </a:xfrm>
+                          <a:prstGeom prst="rect">
+                            <a:avLst/>
+                          </a:prstGeom>
+                        </pic:spPr>
+                      </pic:pic>
+                    </a:graphicData>
+                  </a:graphic>
+                </wp:inline>
+              </w:drawing>
+            </w:r>
+          </w:p>
+        </w:tc>
+        <w:tc>
+          <w:tcPr>
+            <w:tcW w:w="0" w:type="auto"/>
+            <w:vAlign w:val="center"/>
+          </w:tcPr>
+          <w:p>
+            <w:pPr>
+              <w:jc w:val="center"/>
+            </w:pPr>
+            <w:r>
+              <w:drawing>
+                <wp:inline distT="0" distB="0" distL="0" distR="0" wp14:anchorId="4CC92147" wp14:editId="1930DF4A">
+                  <wp:extent cx="1519200" cy="2332800"/>
+                  <wp:effectExtent l="0" t="0" r="5080" b="0"/>
+                  <wp:docPr id="2099772595" name="Image 1">
+                    <a:extLst xmlns:a="http://schemas.openxmlformats.org/drawingml/2006/main">
+                      <a:ext uri="{FF2B5EF4-FFF2-40B4-BE49-F238E27FC236}">
+                        <a16:creationId xmlns:a16="http://schemas.microsoft.com/office/drawing/2014/main" id="{77930CC5-603D-F620-A025-8A2750CABFBC}"/>
+                      </a:ext>
+                    </a:extLst>
+                  </wp:docPr>
+                  <wp:cNvGraphicFramePr>
+                    <a:graphicFrameLocks xmlns:a="http://schemas.openxmlformats.org/drawingml/2006/main" noChangeAspect="1"/>
+                  </wp:cNvGraphicFramePr>
+                  <a:graphic xmlns:a="http://schemas.openxmlformats.org/drawingml/2006/main">
+                    <a:graphicData uri="http://schemas.openxmlformats.org/drawingml/2006/picture">
+                      <pic:pic xmlns:pic="http://schemas.openxmlformats.org/drawingml/2006/picture">
+                        <pic:nvPicPr>
+                          <pic:cNvPr id="2" name="Image 1">
                             <a:extLst>
-                              <a:ext uri="{28A0092B-C50C-407E-A947-70E740481C1C}">
-                                <a14:useLocalDpi xmlns:a14="http://schemas.microsoft.com/office/drawing/2010/main" val="0"/>
+                              <a:ext uri="{FF2B5EF4-FFF2-40B4-BE49-F238E27FC236}">
+                                <a16:creationId xmlns:a16="http://schemas.microsoft.com/office/drawing/2014/main" id="{77930CC5-603D-F620-A025-8A2750CABFBC}"/>
                               </a:ext>
                             </a:extLst>
-                          </a:blip>
+                          </pic:cNvPr>
+                          <pic:cNvPicPr>
+                            <a:picLocks noChangeAspect="1"/>
+                          </pic:cNvPicPr>
+                        </pic:nvPicPr>
+                        <pic:blipFill>
+                          <a:blip r:embed="rId9"/>
+                          <a:stretch>
+                            <a:fillRect/>
+                          </a:stretch>
+                        </pic:blipFill>
+                        <pic:spPr>
+                          <a:xfrm>
+                            <a:off x="0" y="0"/>
+                            <a:ext cx="1519200" cy="2332800"/>
+                          </a:xfrm>
+                          <a:prstGeom prst="rect">
+                            <a:avLst/>
+                          </a:prstGeom>
+                        </pic:spPr>
+                      </pic:pic>
+                    </a:graphicData>
+                  </a:graphic>
+                </wp:inline>
+              </w:drawing>
+            </w:r>
+          </w:p>
+        </w:tc>
+        <w:tc>
+          <w:tcPr>
+            <w:tcW w:w="0" w:type="auto"/>
+            <w:vAlign w:val="center"/>
+          </w:tcPr>
+          <w:p>
+            <w:pPr>
+              <w:jc w:val="center"/>
+            </w:pPr>
+            <w:r>
+              <w:drawing>
+                <wp:inline distT="0" distB="0" distL="0" distR="0" wp14:anchorId="2477F428" wp14:editId="55D76979">
+                  <wp:extent cx="1526400" cy="2332800"/>
+                  <wp:effectExtent l="0" t="0" r="0" b="0"/>
+                  <wp:docPr id="1143302382" name="Image 2">
+                    <a:extLst xmlns:a="http://schemas.openxmlformats.org/drawingml/2006/main">
+                      <a:ext uri="{FF2B5EF4-FFF2-40B4-BE49-F238E27FC236}">
+                        <a16:creationId xmlns:a16="http://schemas.microsoft.com/office/drawing/2014/main" id="{FE231051-3DED-55DA-2ADF-909FB14C76DD}"/>
+                      </a:ext>
+                    </a:extLst>
+                  </wp:docPr>
+                  <wp:cNvGraphicFramePr>
+                    <a:graphicFrameLocks xmlns:a="http://schemas.openxmlformats.org/drawingml/2006/main" noChangeAspect="1"/>
+                  </wp:cNvGraphicFramePr>
+                  <a:graphic xmlns:a="http://schemas.openxmlformats.org/drawingml/2006/main">
+                    <a:graphicData uri="http://schemas.openxmlformats.org/drawingml/2006/picture">
+                      <pic:pic xmlns:pic="http://schemas.openxmlformats.org/drawingml/2006/picture">
+                        <pic:nvPicPr>
+                          <pic:cNvPr id="3" name="Image 2">
+                            <a:extLst>
+                              <a:ext uri="{FF2B5EF4-FFF2-40B4-BE49-F238E27FC236}">
+                                <a16:creationId xmlns:a16="http://schemas.microsoft.com/office/drawing/2014/main" id="{FE231051-3DED-55DA-2ADF-909FB14C76DD}"/>
+                              </a:ext>
+                            </a:extLst>
+                          </pic:cNvPr>
+                          <pic:cNvPicPr>
+                            <a:picLocks noChangeAspect="1"/>
+                          </pic:cNvPicPr>
+                        </pic:nvPicPr>
+                        <pic:blipFill>
+                          <a:blip r:embed="rId10"/>
+                          <a:stretch>
+                            <a:fillRect/>
+                          </a:stretch>
+                        </pic:blipFill>
+                        <pic:spPr>
+                          <a:xfrm>
+                            <a:off x="0" y="0"/>
+                            <a:ext cx="1526400" cy="2332800"/>
+                          </a:xfrm>
+                          <a:prstGeom prst="rect">
+                            <a:avLst/>
+                          </a:prstGeom>
+                        </pic:spPr>
+                      </pic:pic>
+                    </a:graphicData>
+                  </a:graphic>
+                </wp:inline>
+              </w:drawing>
+            </w:r>
+          </w:p>
+        </w:tc>
+        <w:tc>
+          <w:tcPr>
+            <w:tcW w:w="0" w:type="auto"/>
+            <w:vAlign w:val="center"/>
+          </w:tcPr>
+          <w:p>
+            <w:pPr>
+              <w:jc w:val="center"/>
+            </w:pPr>
+            <w:r>
+              <w:drawing>
+                <wp:inline distT="0" distB="0" distL="0" distR="0" wp14:anchorId="72CF70FE" wp14:editId="0537E2D0">
+                  <wp:extent cx="1526400" cy="2332800"/>
+                  <wp:effectExtent l="0" t="0" r="0" b="0"/>
+                  <wp:docPr id="1305392263" name="Image 3">
+                    <a:extLst xmlns:a="http://schemas.openxmlformats.org/drawingml/2006/main">
+                      <a:ext uri="{FF2B5EF4-FFF2-40B4-BE49-F238E27FC236}">
+                        <a16:creationId xmlns:a16="http://schemas.microsoft.com/office/drawing/2014/main" id="{BB6C0767-37E7-54E3-1E06-3D565775AF99}"/>
+                      </a:ext>
+                    </a:extLst>
+                  </wp:docPr>
+                  <wp:cNvGraphicFramePr>
+                    <a:graphicFrameLocks xmlns:a="http://schemas.openxmlformats.org/drawingml/2006/main" noChangeAspect="1"/>
+                  </wp:cNvGraphicFramePr>
+                  <a:graphic xmlns:a="http://schemas.openxmlformats.org/drawingml/2006/main">
+                    <a:graphicData uri="http://schemas.openxmlformats.org/drawingml/2006/picture">
+                      <pic:pic xmlns:pic="http://schemas.openxmlformats.org/drawingml/2006/picture">
+                        <pic:nvPicPr>
+                          <pic:cNvPr id="4" name="Image 3">
+                            <a:extLst>
+                              <a:ext uri="{FF2B5EF4-FFF2-40B4-BE49-F238E27FC236}">
+                                <a16:creationId xmlns:a16="http://schemas.microsoft.com/office/drawing/2014/main" id="{BB6C0767-37E7-54E3-1E06-3D565775AF99}"/>
+                              </a:ext>
+                            </a:extLst>
+                          </pic:cNvPr>
+                          <pic:cNvPicPr>
+                            <a:picLocks noChangeAspect="1"/>
+                          </pic:cNvPicPr>
+                        </pic:nvPicPr>
+                        <pic:blipFill>
+                          <a:blip r:embed="rId11"/>
+                          <a:stretch>
+                            <a:fillRect/>
+                          </a:stretch>
+                        </pic:blipFill>
+                        <pic:spPr>
+                          <a:xfrm>
+                            <a:off x="0" y="0"/>
+                            <a:ext cx="1526400" cy="2332800"/>
+                          </a:xfrm>
+                          <a:prstGeom prst="rect">
+                            <a:avLst/>
+                          </a:prstGeom>
+                        </pic:spPr>
+                      </pic:pic>
+                    </a:graphicData>
+                  </a:graphic>
+                </wp:inline>
+              </w:drawing>
+            </w:r>
+          </w:p>
+        </w:tc>
+      </w:tr>
+      <w:tr>
+        <w:tblPrEx>
+          <w:tblCellMar>
+            <w:left w:w="28" w:type="dxa"/>
+            <w:right w:w="28" w:type="dxa"/>
+          </w:tblCellMar>
+        </w:tblPrEx>
+        <w:trPr>
+          <w:jc w:val="center"/>
+        </w:trPr>
+        <w:tc>
+          <w:tcPr>
+            <w:tcW w:w="0" w:type="auto"/>
+            <w:vAlign w:val="center"/>
+          </w:tcPr>
+          <w:p>
+            <w:pPr>
+              <w:jc w:val="center"/>
+            </w:pPr>
+            <w:r>
+              <w:drawing>
+                <wp:inline distT="0" distB="0" distL="0" distR="0" wp14:anchorId="3874B14E" wp14:editId="385FDAE0">
+                  <wp:extent cx="1504800" cy="2332800"/>
+                  <wp:effectExtent l="0" t="0" r="635" b="0"/>
+                  <wp:docPr id="1560360741" name="Image 1">
+                    <a:extLst xmlns:a="http://schemas.openxmlformats.org/drawingml/2006/main">
+                      <a:ext uri="{FF2B5EF4-FFF2-40B4-BE49-F238E27FC236}">
+                        <a16:creationId xmlns:a16="http://schemas.microsoft.com/office/drawing/2014/main" id="{E8C018BC-94D3-9DD3-4936-A4188C392312}"/>
+                      </a:ext>
+                    </a:extLst>
+                  </wp:docPr>
+                  <wp:cNvGraphicFramePr>
+                    <a:graphicFrameLocks xmlns:a="http://schemas.openxmlformats.org/drawingml/2006/main" noChangeAspect="1"/>
+                  </wp:cNvGraphicFramePr>
+                  <a:graphic xmlns:a="http://schemas.openxmlformats.org/drawingml/2006/main">
+                    <a:graphicData uri="http://schemas.openxmlformats.org/drawingml/2006/picture">
+                      <pic:pic xmlns:pic="http://schemas.openxmlformats.org/drawingml/2006/picture">
+                        <pic:nvPicPr>
+                          <pic:cNvPr id="2" name="Image 1">
+                            <a:extLst>
+                              <a:ext uri="{FF2B5EF4-FFF2-40B4-BE49-F238E27FC236}">
+                                <a16:creationId xmlns:a16="http://schemas.microsoft.com/office/drawing/2014/main" id="{E8C018BC-94D3-9DD3-4936-A4188C392312}"/>
+                              </a:ext>
+                            </a:extLst>
+                          </pic:cNvPr>
+                          <pic:cNvPicPr>
+                            <a:picLocks noChangeAspect="1"/>
+                          </pic:cNvPicPr>
+                        </pic:nvPicPr>
+                        <pic:blipFill>
+                          <a:blip r:embed="rId12"/>
+                          <a:stretch>
+                            <a:fillRect/>
+                          </a:stretch>
+                        </pic:blipFill>
+                        <pic:spPr>
+                          <a:xfrm>
+                            <a:off x="0" y="0"/>
+                            <a:ext cx="1504800" cy="2332800"/>
+                          </a:xfrm>
+                          <a:prstGeom prst="rect">
+                            <a:avLst/>
+                          </a:prstGeom>
+                        </pic:spPr>
+                      </pic:pic>
+                    </a:graphicData>
+                  </a:graphic>
+                </wp:inline>
+              </w:drawing>
+            </w:r>
+          </w:p>
+        </w:tc>
+        <w:tc>
+          <w:tcPr>
+            <w:tcW w:w="0" w:type="auto"/>
+            <w:vAlign w:val="center"/>
+          </w:tcPr>
+          <w:p>
+            <w:pPr>
+              <w:jc w:val="center"/>
+            </w:pPr>
+            <w:r>
+              <w:drawing>
+                <wp:inline distT="0" distB="0" distL="0" distR="0" wp14:anchorId="65E06B80" wp14:editId="329965BC">
+                  <wp:extent cx="1501200" cy="2332800"/>
+                  <wp:effectExtent l="0" t="0" r="3810" b="0"/>
+                  <wp:docPr id="6" name="Image 5">
+                    <a:extLst xmlns:a="http://schemas.openxmlformats.org/drawingml/2006/main">
+                      <a:ext uri="{FF2B5EF4-FFF2-40B4-BE49-F238E27FC236}">
+                        <a16:creationId xmlns:a16="http://schemas.microsoft.com/office/drawing/2014/main" id="{483FF877-1425-866D-2597-40D7E2453A6A}"/>
+                      </a:ext>
+                    </a:extLst>
+                  </wp:docPr>
+                  <wp:cNvGraphicFramePr>
+                    <a:graphicFrameLocks xmlns:a="http://schemas.openxmlformats.org/drawingml/2006/main" noChangeAspect="1"/>
+                  </wp:cNvGraphicFramePr>
+                  <a:graphic xmlns:a="http://schemas.openxmlformats.org/drawingml/2006/main">
+                    <a:graphicData uri="http://schemas.openxmlformats.org/drawingml/2006/picture">
+                      <pic:pic xmlns:pic="http://schemas.openxmlformats.org/drawingml/2006/picture">
+                        <pic:nvPicPr>
+                          <pic:cNvPr id="6" name="Image 5">
+                            <a:extLst>
+                              <a:ext uri="{FF2B5EF4-FFF2-40B4-BE49-F238E27FC236}">
+                                <a16:creationId xmlns:a16="http://schemas.microsoft.com/office/drawing/2014/main" id="{483FF877-1425-866D-2597-40D7E2453A6A}"/>
+                              </a:ext>
+                            </a:extLst>
+                          </pic:cNvPr>
+                          <pic:cNvPicPr>
+                            <a:picLocks noChangeAspect="1"/>
+                          </pic:cNvPicPr>
+                        </pic:nvPicPr>
+                        <pic:blipFill>
+                          <a:blip r:embed="rId13"/>
                           <a:stretch>
                             <a:fillRect/>
                           </a:stretch>
@@ -635,17 +644,14 @@
               <w:jc w:val="center"/>
             </w:pPr>
             <w:r>
-              <w:rPr>
-                <w:noProof/>
-              </w:rPr>
               <w:drawing>
-                <wp:inline distT="0" distB="0" distL="0" distR="0" wp14:anchorId="24729F1A" wp14:editId="5C4E5FD1">
+                <wp:inline distT="0" distB="0" distL="0" distR="0" wp14:anchorId="75D0A181" wp14:editId="51CA037E">
                   <wp:extent cx="1497600" cy="2332800"/>
                   <wp:effectExtent l="0" t="0" r="7620" b="0"/>
-                  <wp:docPr id="1935958147" name="Image 1" descr="Une image contenant texte, capture d’écran, Police, livre&#10;&#10;Le contenu généré par l’IA peut être incorrect.">
+                  <wp:docPr id="7" name="Image 6">
                     <a:extLst xmlns:a="http://schemas.openxmlformats.org/drawingml/2006/main">
                       <a:ext uri="{FF2B5EF4-FFF2-40B4-BE49-F238E27FC236}">
-                        <a16:creationId xmlns:a16="http://schemas.microsoft.com/office/drawing/2014/main" id="{2D38AA5B-31AD-E767-770B-E503E59FBB90}"/>
+                        <a16:creationId xmlns:a16="http://schemas.microsoft.com/office/drawing/2014/main" id="{EB80F100-6717-823E-2A03-2B533B318768}"/>
                       </a:ext>
                     </a:extLst>
                   </wp:docPr>
@@ -656,10 +662,10 @@
                     <a:graphicData uri="http://schemas.openxmlformats.org/drawingml/2006/picture">
                       <pic:pic xmlns:pic="http://schemas.openxmlformats.org/drawingml/2006/picture">
                         <pic:nvPicPr>
-                          <pic:cNvPr id="1935958147" name="Image 1" descr="Une image contenant texte, capture d’écran, Police, livre&#10;&#10;Le contenu généré par l’IA peut être incorrect.">
+                          <pic:cNvPr id="7" name="Image 6">
                             <a:extLst>
                               <a:ext uri="{FF2B5EF4-FFF2-40B4-BE49-F238E27FC236}">
-                                <a16:creationId xmlns:a16="http://schemas.microsoft.com/office/drawing/2014/main" id="{2D38AA5B-31AD-E767-770B-E503E59FBB90}"/>
+                                <a16:creationId xmlns:a16="http://schemas.microsoft.com/office/drawing/2014/main" id="{EB80F100-6717-823E-2A03-2B533B318768}"/>
                               </a:ext>
                             </a:extLst>
                           </pic:cNvPr>
@@ -668,13 +674,204 @@
                           </pic:cNvPicPr>
                         </pic:nvPicPr>
                         <pic:blipFill>
-                          <a:blip r:embed="rId13">
+                          <a:blip r:embed="rId14"/>
+                          <a:stretch>
+                            <a:fillRect/>
+                          </a:stretch>
+                        </pic:blipFill>
+                        <pic:spPr>
+                          <a:xfrm>
+                            <a:off x="0" y="0"/>
+                            <a:ext cx="1497600" cy="2332800"/>
+                          </a:xfrm>
+                          <a:prstGeom prst="rect">
+                            <a:avLst/>
+                          </a:prstGeom>
+                        </pic:spPr>
+                      </pic:pic>
+                    </a:graphicData>
+                  </a:graphic>
+                </wp:inline>
+              </w:drawing>
+            </w:r>
+          </w:p>
+        </w:tc>
+        <w:tc>
+          <w:tcPr>
+            <w:tcW w:w="0" w:type="auto"/>
+            <w:vAlign w:val="center"/>
+          </w:tcPr>
+          <w:p>
+            <w:pPr>
+              <w:jc w:val="center"/>
+            </w:pPr>
+            <w:r>
+              <w:drawing>
+                <wp:inline distT="0" distB="0" distL="0" distR="0" wp14:anchorId="114172C6" wp14:editId="3EC86680">
+                  <wp:extent cx="1587600" cy="2332800"/>
+                  <wp:effectExtent l="0" t="0" r="0" b="0"/>
+                  <wp:docPr id="691535635" name="Image 1">
+                    <a:extLst xmlns:a="http://schemas.openxmlformats.org/drawingml/2006/main">
+                      <a:ext uri="{FF2B5EF4-FFF2-40B4-BE49-F238E27FC236}">
+                        <a16:creationId xmlns:a16="http://schemas.microsoft.com/office/drawing/2014/main" id="{91724C95-643E-6F34-9712-D845E8E84C50}"/>
+                      </a:ext>
+                    </a:extLst>
+                  </wp:docPr>
+                  <wp:cNvGraphicFramePr>
+                    <a:graphicFrameLocks xmlns:a="http://schemas.openxmlformats.org/drawingml/2006/main" noChangeAspect="1"/>
+                  </wp:cNvGraphicFramePr>
+                  <a:graphic xmlns:a="http://schemas.openxmlformats.org/drawingml/2006/main">
+                    <a:graphicData uri="http://schemas.openxmlformats.org/drawingml/2006/picture">
+                      <pic:pic xmlns:pic="http://schemas.openxmlformats.org/drawingml/2006/picture">
+                        <pic:nvPicPr>
+                          <pic:cNvPr id="2" name="Image 1">
                             <a:extLst>
-                              <a:ext uri="{28A0092B-C50C-407E-A947-70E740481C1C}">
-                                <a14:useLocalDpi xmlns:a14="http://schemas.microsoft.com/office/drawing/2010/main" val="0"/>
+                              <a:ext uri="{FF2B5EF4-FFF2-40B4-BE49-F238E27FC236}">
+                                <a16:creationId xmlns:a16="http://schemas.microsoft.com/office/drawing/2014/main" id="{91724C95-643E-6F34-9712-D845E8E84C50}"/>
                               </a:ext>
                             </a:extLst>
-                          </a:blip>
+                          </pic:cNvPr>
+                          <pic:cNvPicPr>
+                            <a:picLocks noChangeAspect="1"/>
+                          </pic:cNvPicPr>
+                        </pic:nvPicPr>
+                        <pic:blipFill>
+                          <a:blip r:embed="rId15"/>
+                          <a:stretch>
+                            <a:fillRect/>
+                          </a:stretch>
+                        </pic:blipFill>
+                        <pic:spPr>
+                          <a:xfrm>
+                            <a:off x="0" y="0"/>
+                            <a:ext cx="1587600" cy="2332800"/>
+                          </a:xfrm>
+                          <a:prstGeom prst="rect">
+                            <a:avLst/>
+                          </a:prstGeom>
+                        </pic:spPr>
+                      </pic:pic>
+                    </a:graphicData>
+                  </a:graphic>
+                </wp:inline>
+              </w:drawing>
+            </w:r>
+          </w:p>
+        </w:tc>
+      </w:tr>
+      <w:tr>
+        <w:tblPrEx>
+          <w:tblCellMar>
+            <w:left w:w="28" w:type="dxa"/>
+            <w:right w:w="28" w:type="dxa"/>
+          </w:tblCellMar>
+        </w:tblPrEx>
+        <w:trPr>
+          <w:jc w:val="center"/>
+        </w:trPr>
+        <w:tc>
+          <w:tcPr>
+            <w:tcW w:w="0" w:type="auto"/>
+            <w:vAlign w:val="center"/>
+          </w:tcPr>
+          <w:p>
+            <w:pPr>
+              <w:jc w:val="center"/>
+            </w:pPr>
+            <w:r>
+              <w:drawing>
+                <wp:inline distT="0" distB="0" distL="0" distR="0" wp14:anchorId="386D53A2" wp14:editId="64CC5EAA">
+                  <wp:extent cx="1497600" cy="2332800"/>
+                  <wp:effectExtent l="0" t="0" r="7620" b="0"/>
+                  <wp:docPr id="933700547" name="Image 3">
+                    <a:extLst xmlns:a="http://schemas.openxmlformats.org/drawingml/2006/main">
+                      <a:ext uri="{FF2B5EF4-FFF2-40B4-BE49-F238E27FC236}">
+                        <a16:creationId xmlns:a16="http://schemas.microsoft.com/office/drawing/2014/main" id="{845CB645-0E5B-87FD-20D7-3380C0F523ED}"/>
+                      </a:ext>
+                    </a:extLst>
+                  </wp:docPr>
+                  <wp:cNvGraphicFramePr>
+                    <a:graphicFrameLocks xmlns:a="http://schemas.openxmlformats.org/drawingml/2006/main" noChangeAspect="1"/>
+                  </wp:cNvGraphicFramePr>
+                  <a:graphic xmlns:a="http://schemas.openxmlformats.org/drawingml/2006/main">
+                    <a:graphicData uri="http://schemas.openxmlformats.org/drawingml/2006/picture">
+                      <pic:pic xmlns:pic="http://schemas.openxmlformats.org/drawingml/2006/picture">
+                        <pic:nvPicPr>
+                          <pic:cNvPr id="4" name="Image 3">
+                            <a:extLst>
+                              <a:ext uri="{FF2B5EF4-FFF2-40B4-BE49-F238E27FC236}">
+                                <a16:creationId xmlns:a16="http://schemas.microsoft.com/office/drawing/2014/main" id="{845CB645-0E5B-87FD-20D7-3380C0F523ED}"/>
+                              </a:ext>
+                            </a:extLst>
+                          </pic:cNvPr>
+                          <pic:cNvPicPr>
+                            <a:picLocks noChangeAspect="1"/>
+                          </pic:cNvPicPr>
+                        </pic:nvPicPr>
+                        <pic:blipFill>
+                          <a:blip r:embed="rId16"/>
+                          <a:stretch>
+                            <a:fillRect/>
+                          </a:stretch>
+                        </pic:blipFill>
+                        <pic:spPr>
+                          <a:xfrm>
+                            <a:off x="0" y="0"/>
+                            <a:ext cx="1497600" cy="2332800"/>
+                          </a:xfrm>
+                          <a:prstGeom prst="rect">
+                            <a:avLst/>
+                          </a:prstGeom>
+                        </pic:spPr>
+                      </pic:pic>
+                    </a:graphicData>
+                  </a:graphic>
+                </wp:inline>
+              </w:drawing>
+            </w:r>
+          </w:p>
+        </w:tc>
+        <w:tc>
+          <w:tcPr>
+            <w:tcW w:w="0" w:type="auto"/>
+            <w:vAlign w:val="center"/>
+          </w:tcPr>
+          <w:p>
+            <w:pPr>
+              <w:jc w:val="center"/>
+            </w:pPr>
+            <w:r>
+              <w:drawing>
+                <wp:inline distT="0" distB="0" distL="0" distR="0" wp14:anchorId="0663C211" wp14:editId="61116F01">
+                  <wp:extent cx="1497600" cy="2332800"/>
+                  <wp:effectExtent l="0" t="0" r="7620" b="0"/>
+                  <wp:docPr id="5" name="Image 4">
+                    <a:extLst xmlns:a="http://schemas.openxmlformats.org/drawingml/2006/main">
+                      <a:ext uri="{FF2B5EF4-FFF2-40B4-BE49-F238E27FC236}">
+                        <a16:creationId xmlns:a16="http://schemas.microsoft.com/office/drawing/2014/main" id="{4CEA7930-8F3B-9EA1-A5B7-2794B54A06B5}"/>
+                      </a:ext>
+                    </a:extLst>
+                  </wp:docPr>
+                  <wp:cNvGraphicFramePr>
+                    <a:graphicFrameLocks xmlns:a="http://schemas.openxmlformats.org/drawingml/2006/main" noChangeAspect="1"/>
+                  </wp:cNvGraphicFramePr>
+                  <a:graphic xmlns:a="http://schemas.openxmlformats.org/drawingml/2006/main">
+                    <a:graphicData uri="http://schemas.openxmlformats.org/drawingml/2006/picture">
+                      <pic:pic xmlns:pic="http://schemas.openxmlformats.org/drawingml/2006/picture">
+                        <pic:nvPicPr>
+                          <pic:cNvPr id="5" name="Image 4">
+                            <a:extLst>
+                              <a:ext uri="{FF2B5EF4-FFF2-40B4-BE49-F238E27FC236}">
+                                <a16:creationId xmlns:a16="http://schemas.microsoft.com/office/drawing/2014/main" id="{4CEA7930-8F3B-9EA1-A5B7-2794B54A06B5}"/>
+                              </a:ext>
+                            </a:extLst>
+                          </pic:cNvPr>
+                          <pic:cNvPicPr>
+                            <a:picLocks noChangeAspect="1"/>
+                          </pic:cNvPicPr>
+                        </pic:nvPicPr>
+                        <pic:blipFill>
+                          <a:blip r:embed="rId17"/>
                           <a:stretch>
                             <a:fillRect/>
                           </a:stretch>
@@ -709,298 +906,6 @@
               <w:rPr>
                 <w:noProof/>
               </w:rPr>
-              <w:drawing>
-                <wp:inline distT="0" distB="0" distL="0" distR="0" wp14:anchorId="4A94311E" wp14:editId="322D27EA">
-                  <wp:extent cx="1497600" cy="2332800"/>
-                  <wp:effectExtent l="0" t="0" r="7620" b="0"/>
-                  <wp:docPr id="48848661" name="Image 1" descr="Une image contenant texte, capture d’écran, livre, Police&#10;&#10;Le contenu généré par l’IA peut être incorrect.">
-                    <a:extLst xmlns:a="http://schemas.openxmlformats.org/drawingml/2006/main">
-                      <a:ext uri="{FF2B5EF4-FFF2-40B4-BE49-F238E27FC236}">
-                        <a16:creationId xmlns:a16="http://schemas.microsoft.com/office/drawing/2014/main" id="{F5BFEB00-0D04-57A5-61E6-CE0480D39127}"/>
-                      </a:ext>
-                    </a:extLst>
-                  </wp:docPr>
-                  <wp:cNvGraphicFramePr>
-                    <a:graphicFrameLocks xmlns:a="http://schemas.openxmlformats.org/drawingml/2006/main" noChangeAspect="1"/>
-                  </wp:cNvGraphicFramePr>
-                  <a:graphic xmlns:a="http://schemas.openxmlformats.org/drawingml/2006/main">
-                    <a:graphicData uri="http://schemas.openxmlformats.org/drawingml/2006/picture">
-                      <pic:pic xmlns:pic="http://schemas.openxmlformats.org/drawingml/2006/picture">
-                        <pic:nvPicPr>
-                          <pic:cNvPr id="48848661" name="Image 1" descr="Une image contenant texte, capture d’écran, livre, Police&#10;&#10;Le contenu généré par l’IA peut être incorrect.">
-                            <a:extLst>
-                              <a:ext uri="{FF2B5EF4-FFF2-40B4-BE49-F238E27FC236}">
-                                <a16:creationId xmlns:a16="http://schemas.microsoft.com/office/drawing/2014/main" id="{F5BFEB00-0D04-57A5-61E6-CE0480D39127}"/>
-                              </a:ext>
-                            </a:extLst>
-                          </pic:cNvPr>
-                          <pic:cNvPicPr>
-                            <a:picLocks noChangeAspect="1"/>
-                          </pic:cNvPicPr>
-                        </pic:nvPicPr>
-                        <pic:blipFill>
-                          <a:blip r:embed="rId14">
-                            <a:extLst>
-                              <a:ext uri="{28A0092B-C50C-407E-A947-70E740481C1C}">
-                                <a14:useLocalDpi xmlns:a14="http://schemas.microsoft.com/office/drawing/2010/main" val="0"/>
-                              </a:ext>
-                            </a:extLst>
-                          </a:blip>
-                          <a:stretch>
-                            <a:fillRect/>
-                          </a:stretch>
-                        </pic:blipFill>
-                        <pic:spPr>
-                          <a:xfrm>
-                            <a:off x="0" y="0"/>
-                            <a:ext cx="1497600" cy="2332800"/>
-                          </a:xfrm>
-                          <a:prstGeom prst="rect">
-                            <a:avLst/>
-                          </a:prstGeom>
-                        </pic:spPr>
-                      </pic:pic>
-                    </a:graphicData>
-                  </a:graphic>
-                </wp:inline>
-              </w:drawing>
-            </w:r>
-          </w:p>
-        </w:tc>
-        <w:tc>
-          <w:tcPr>
-            <w:tcW w:w="0" w:type="auto"/>
-            <w:vAlign w:val="center"/>
-          </w:tcPr>
-          <w:p>
-            <w:pPr>
-              <w:jc w:val="center"/>
-            </w:pPr>
-            <w:r>
-              <w:rPr>
-                <w:noProof/>
-              </w:rPr>
-              <w:drawing>
-                <wp:inline distT="0" distB="0" distL="0" distR="0" wp14:anchorId="5B6B5516" wp14:editId="3FAC1DFC">
-                  <wp:extent cx="1587500" cy="2332355"/>
-                  <wp:effectExtent l="0" t="0" r="0" b="0"/>
-                  <wp:docPr id="74211042" name="Image 1" descr="Une image contenant texte, cheval, capture d’écran, mammifère&#10;&#10;Le contenu généré par l’IA peut être incorrect.">
-                    <a:extLst xmlns:a="http://schemas.openxmlformats.org/drawingml/2006/main">
-                      <a:ext uri="{FF2B5EF4-FFF2-40B4-BE49-F238E27FC236}">
-                        <a16:creationId xmlns:a16="http://schemas.microsoft.com/office/drawing/2014/main" id="{751FDBE4-A4D2-24F2-D3EC-B4BCE2DDA907}"/>
-                      </a:ext>
-                    </a:extLst>
-                  </wp:docPr>
-                  <wp:cNvGraphicFramePr>
-                    <a:graphicFrameLocks xmlns:a="http://schemas.openxmlformats.org/drawingml/2006/main" noChangeAspect="1"/>
-                  </wp:cNvGraphicFramePr>
-                  <a:graphic xmlns:a="http://schemas.openxmlformats.org/drawingml/2006/main">
-                    <a:graphicData uri="http://schemas.openxmlformats.org/drawingml/2006/picture">
-                      <pic:pic xmlns:pic="http://schemas.openxmlformats.org/drawingml/2006/picture">
-                        <pic:nvPicPr>
-                          <pic:cNvPr id="74211042" name="Image 1" descr="Une image contenant texte, cheval, capture d’écran, mammifère&#10;&#10;Le contenu généré par l’IA peut être incorrect.">
-                            <a:extLst>
-                              <a:ext uri="{FF2B5EF4-FFF2-40B4-BE49-F238E27FC236}">
-                                <a16:creationId xmlns:a16="http://schemas.microsoft.com/office/drawing/2014/main" id="{751FDBE4-A4D2-24F2-D3EC-B4BCE2DDA907}"/>
-                              </a:ext>
-                            </a:extLst>
-                          </pic:cNvPr>
-                          <pic:cNvPicPr>
-                            <a:picLocks noChangeAspect="1"/>
-                          </pic:cNvPicPr>
-                        </pic:nvPicPr>
-                        <pic:blipFill>
-                          <a:blip r:embed="rId15">
-                            <a:extLst>
-                              <a:ext uri="{28A0092B-C50C-407E-A947-70E740481C1C}">
-                                <a14:useLocalDpi xmlns:a14="http://schemas.microsoft.com/office/drawing/2010/main" val="0"/>
-                              </a:ext>
-                            </a:extLst>
-                          </a:blip>
-                          <a:stretch>
-                            <a:fillRect/>
-                          </a:stretch>
-                        </pic:blipFill>
-                        <pic:spPr>
-                          <a:xfrm>
-                            <a:off x="0" y="0"/>
-                            <a:ext cx="1587500" cy="2332355"/>
-                          </a:xfrm>
-                          <a:prstGeom prst="rect">
-                            <a:avLst/>
-                          </a:prstGeom>
-                        </pic:spPr>
-                      </pic:pic>
-                    </a:graphicData>
-                  </a:graphic>
-                </wp:inline>
-              </w:drawing>
-            </w:r>
-          </w:p>
-        </w:tc>
-      </w:tr>
-      <w:tr>
-        <w:tblPrEx>
-          <w:tblCellMar>
-            <w:left w:w="28" w:type="dxa"/>
-            <w:right w:w="28" w:type="dxa"/>
-          </w:tblCellMar>
-        </w:tblPrEx>
-        <w:trPr>
-          <w:jc w:val="center"/>
-        </w:trPr>
-        <w:tc>
-          <w:tcPr>
-            <w:tcW w:w="0" w:type="auto"/>
-            <w:vAlign w:val="center"/>
-          </w:tcPr>
-          <w:p>
-            <w:pPr>
-              <w:jc w:val="center"/>
-            </w:pPr>
-            <w:r>
-              <w:rPr>
-                <w:noProof/>
-              </w:rPr>
-              <w:drawing>
-                <wp:inline distT="0" distB="0" distL="0" distR="0" wp14:anchorId="13550798" wp14:editId="4011088B">
-                  <wp:extent cx="1497600" cy="2332800"/>
-                  <wp:effectExtent l="0" t="0" r="7620" b="0"/>
-                  <wp:docPr id="1291361759" name="Image 1" descr="Une image contenant texte, dessin humoristique, affiche, livre&#10;&#10;Le contenu généré par l’IA peut être incorrect.">
-                    <a:extLst xmlns:a="http://schemas.openxmlformats.org/drawingml/2006/main">
-                      <a:ext uri="{FF2B5EF4-FFF2-40B4-BE49-F238E27FC236}">
-                        <a16:creationId xmlns:a16="http://schemas.microsoft.com/office/drawing/2014/main" id="{5B1597EF-69AF-D508-263B-E9A140F25184}"/>
-                      </a:ext>
-                    </a:extLst>
-                  </wp:docPr>
-                  <wp:cNvGraphicFramePr>
-                    <a:graphicFrameLocks xmlns:a="http://schemas.openxmlformats.org/drawingml/2006/main" noChangeAspect="1"/>
-                  </wp:cNvGraphicFramePr>
-                  <a:graphic xmlns:a="http://schemas.openxmlformats.org/drawingml/2006/main">
-                    <a:graphicData uri="http://schemas.openxmlformats.org/drawingml/2006/picture">
-                      <pic:pic xmlns:pic="http://schemas.openxmlformats.org/drawingml/2006/picture">
-                        <pic:nvPicPr>
-                          <pic:cNvPr id="1291361759" name="Image 1" descr="Une image contenant texte, dessin humoristique, affiche, livre&#10;&#10;Le contenu généré par l’IA peut être incorrect.">
-                            <a:extLst>
-                              <a:ext uri="{FF2B5EF4-FFF2-40B4-BE49-F238E27FC236}">
-                                <a16:creationId xmlns:a16="http://schemas.microsoft.com/office/drawing/2014/main" id="{5B1597EF-69AF-D508-263B-E9A140F25184}"/>
-                              </a:ext>
-                            </a:extLst>
-                          </pic:cNvPr>
-                          <pic:cNvPicPr>
-                            <a:picLocks noChangeAspect="1"/>
-                          </pic:cNvPicPr>
-                        </pic:nvPicPr>
-                        <pic:blipFill>
-                          <a:blip r:embed="rId16">
-                            <a:extLst>
-                              <a:ext uri="{28A0092B-C50C-407E-A947-70E740481C1C}">
-                                <a14:useLocalDpi xmlns:a14="http://schemas.microsoft.com/office/drawing/2010/main" val="0"/>
-                              </a:ext>
-                            </a:extLst>
-                          </a:blip>
-                          <a:stretch>
-                            <a:fillRect/>
-                          </a:stretch>
-                        </pic:blipFill>
-                        <pic:spPr>
-                          <a:xfrm>
-                            <a:off x="0" y="0"/>
-                            <a:ext cx="1497600" cy="2332800"/>
-                          </a:xfrm>
-                          <a:prstGeom prst="rect">
-                            <a:avLst/>
-                          </a:prstGeom>
-                        </pic:spPr>
-                      </pic:pic>
-                    </a:graphicData>
-                  </a:graphic>
-                </wp:inline>
-              </w:drawing>
-            </w:r>
-          </w:p>
-        </w:tc>
-        <w:tc>
-          <w:tcPr>
-            <w:tcW w:w="0" w:type="auto"/>
-            <w:vAlign w:val="center"/>
-          </w:tcPr>
-          <w:p>
-            <w:pPr>
-              <w:jc w:val="center"/>
-            </w:pPr>
-            <w:r>
-              <w:rPr>
-                <w:noProof/>
-              </w:rPr>
-              <w:drawing>
-                <wp:inline distT="0" distB="0" distL="0" distR="0" wp14:anchorId="64DFBC36" wp14:editId="76444A57">
-                  <wp:extent cx="1497330" cy="2332355"/>
-                  <wp:effectExtent l="0" t="0" r="7620" b="0"/>
-                  <wp:docPr id="3810262" name="Image 1" descr="Une image contenant texte, affiche, dessin humoristique, chaussures&#10;&#10;Le contenu généré par l’IA peut être incorrect.">
-                    <a:extLst xmlns:a="http://schemas.openxmlformats.org/drawingml/2006/main">
-                      <a:ext uri="{FF2B5EF4-FFF2-40B4-BE49-F238E27FC236}">
-                        <a16:creationId xmlns:a16="http://schemas.microsoft.com/office/drawing/2014/main" id="{B936E68B-B4CA-C7B0-E121-D370B467CE06}"/>
-                      </a:ext>
-                    </a:extLst>
-                  </wp:docPr>
-                  <wp:cNvGraphicFramePr>
-                    <a:graphicFrameLocks xmlns:a="http://schemas.openxmlformats.org/drawingml/2006/main" noChangeAspect="1"/>
-                  </wp:cNvGraphicFramePr>
-                  <a:graphic xmlns:a="http://schemas.openxmlformats.org/drawingml/2006/main">
-                    <a:graphicData uri="http://schemas.openxmlformats.org/drawingml/2006/picture">
-                      <pic:pic xmlns:pic="http://schemas.openxmlformats.org/drawingml/2006/picture">
-                        <pic:nvPicPr>
-                          <pic:cNvPr id="3810262" name="Image 1" descr="Une image contenant texte, affiche, dessin humoristique, chaussures&#10;&#10;Le contenu généré par l’IA peut être incorrect.">
-                            <a:extLst>
-                              <a:ext uri="{FF2B5EF4-FFF2-40B4-BE49-F238E27FC236}">
-                                <a16:creationId xmlns:a16="http://schemas.microsoft.com/office/drawing/2014/main" id="{B936E68B-B4CA-C7B0-E121-D370B467CE06}"/>
-                              </a:ext>
-                            </a:extLst>
-                          </pic:cNvPr>
-                          <pic:cNvPicPr>
-                            <a:picLocks noChangeAspect="1"/>
-                          </pic:cNvPicPr>
-                        </pic:nvPicPr>
-                        <pic:blipFill>
-                          <a:blip r:embed="rId17">
-                            <a:extLst>
-                              <a:ext uri="{28A0092B-C50C-407E-A947-70E740481C1C}">
-                                <a14:useLocalDpi xmlns:a14="http://schemas.microsoft.com/office/drawing/2010/main" val="0"/>
-                              </a:ext>
-                            </a:extLst>
-                          </a:blip>
-                          <a:stretch>
-                            <a:fillRect/>
-                          </a:stretch>
-                        </pic:blipFill>
-                        <pic:spPr>
-                          <a:xfrm>
-                            <a:off x="0" y="0"/>
-                            <a:ext cx="1497330" cy="2332355"/>
-                          </a:xfrm>
-                          <a:prstGeom prst="rect">
-                            <a:avLst/>
-                          </a:prstGeom>
-                        </pic:spPr>
-                      </pic:pic>
-                    </a:graphicData>
-                  </a:graphic>
-                </wp:inline>
-              </w:drawing>
-            </w:r>
-          </w:p>
-        </w:tc>
-        <w:tc>
-          <w:tcPr>
-            <w:tcW w:w="0" w:type="auto"/>
-            <w:vAlign w:val="center"/>
-          </w:tcPr>
-          <w:p>
-            <w:pPr>
-              <w:jc w:val="center"/>
-            </w:pPr>
-            <w:r>
               <w:drawing>
                 <wp:inline distT="0" distB="0" distL="0" distR="0" wp14:anchorId="6888B107" wp14:editId="76986705">
                   <wp:extent cx="1497600" cy="2332800"/>

</xml_diff>

<commit_message>
Bonne avancée de la description des cartes Actions et des cartes Evénements
</commit_message>
<xml_diff>
--- a/docs/Presentation-cartes-a-jouer.docx
+++ b/docs/Presentation-cartes-a-jouer.docx
@@ -24,8 +24,8 @@
         <w:tblLook w:val="04A0" w:firstRow="1" w:lastRow="0" w:firstColumn="1" w:lastColumn="0" w:noHBand="0" w:noVBand="1"/>
       </w:tblPr>
       <w:tblGrid>
-        <w:gridCol w:w="2770"/>
-        <w:gridCol w:w="2770"/>
+        <w:gridCol w:w="2687"/>
+        <w:gridCol w:w="2687"/>
         <w:gridCol w:w="2540"/>
         <w:gridCol w:w="2556"/>
       </w:tblGrid>
@@ -48,16 +48,10 @@
                 <w:noProof/>
               </w:rPr>
               <w:drawing>
-                <wp:inline distT="0" distB="0" distL="0" distR="0" wp14:anchorId="09A3CA98" wp14:editId="6B9FE589">
-                  <wp:extent cx="3429000" cy="2676525"/>
-                  <wp:effectExtent l="0" t="0" r="0" b="9525"/>
-                  <wp:docPr id="3" name="Image 2">
-                    <a:extLst xmlns:a="http://schemas.openxmlformats.org/drawingml/2006/main">
-                      <a:ext uri="{FF2B5EF4-FFF2-40B4-BE49-F238E27FC236}">
-                        <a16:creationId xmlns:a16="http://schemas.microsoft.com/office/drawing/2014/main" id="{48039A9E-6179-1E36-EF38-9DE6D2EAFBCE}"/>
-                      </a:ext>
-                    </a:extLst>
-                  </wp:docPr>
+                <wp:inline distT="0" distB="0" distL="0" distR="0" wp14:anchorId="4E03E68D" wp14:editId="75379E1F">
+                  <wp:extent cx="3323229" cy="2293701"/>
+                  <wp:effectExtent l="0" t="0" r="0" b="0"/>
+                  <wp:docPr id="524821246" name="Image 2"/>
                   <wp:cNvGraphicFramePr>
                     <a:graphicFrameLocks xmlns:a="http://schemas.openxmlformats.org/drawingml/2006/main" noChangeAspect="1"/>
                   </wp:cNvGraphicFramePr>
@@ -65,13 +59,7 @@
                     <a:graphicData uri="http://schemas.openxmlformats.org/drawingml/2006/picture">
                       <pic:pic xmlns:pic="http://schemas.openxmlformats.org/drawingml/2006/picture">
                         <pic:nvPicPr>
-                          <pic:cNvPr id="3" name="Image 2">
-                            <a:extLst>
-                              <a:ext uri="{FF2B5EF4-FFF2-40B4-BE49-F238E27FC236}">
-                                <a16:creationId xmlns:a16="http://schemas.microsoft.com/office/drawing/2014/main" id="{48039A9E-6179-1E36-EF38-9DE6D2EAFBCE}"/>
-                              </a:ext>
-                            </a:extLst>
-                          </pic:cNvPr>
+                          <pic:cNvPr id="0" name="Picture 2"/>
                           <pic:cNvPicPr>
                             <a:picLocks noChangeAspect="1" noChangeArrowheads="1"/>
                           </pic:cNvPicPr>
@@ -92,21 +80,15 @@
                         <pic:spPr bwMode="auto">
                           <a:xfrm>
                             <a:off x="0" y="0"/>
-                            <a:ext cx="3429000" cy="2676525"/>
+                            <a:ext cx="3376104" cy="2330196"/>
                           </a:xfrm>
                           <a:prstGeom prst="rect">
                             <a:avLst/>
                           </a:prstGeom>
                           <a:noFill/>
-                          <a:extLst>
-                            <a:ext uri="{909E8E84-426E-40DD-AFC4-6F175D3DCCD1}">
-                              <a14:hiddenFill xmlns:a14="http://schemas.microsoft.com/office/drawing/2010/main">
-                                <a:solidFill>
-                                  <a:srgbClr val="FFFFFF"/>
-                                </a:solidFill>
-                              </a14:hiddenFill>
-                            </a:ext>
-                          </a:extLst>
+                          <a:ln>
+                            <a:noFill/>
+                          </a:ln>
                         </pic:spPr>
                       </pic:pic>
                     </a:graphicData>
@@ -126,6 +108,9 @@
               <w:jc w:val="center"/>
             </w:pPr>
             <w:r>
+              <w:rPr>
+                <w:noProof/>
+              </w:rPr>
               <w:drawing>
                 <wp:inline distT="0" distB="0" distL="0" distR="0" wp14:anchorId="5521E76B" wp14:editId="092BF319">
                   <wp:extent cx="1515600" cy="2332800"/>
@@ -188,6 +173,9 @@
               <w:jc w:val="center"/>
             </w:pPr>
             <w:r>
+              <w:rPr>
+                <w:noProof/>
+              </w:rPr>
               <w:drawing>
                 <wp:inline distT="0" distB="0" distL="0" distR="0" wp14:anchorId="06FBE480" wp14:editId="30E8740C">
                   <wp:extent cx="1515600" cy="2332800"/>
@@ -261,6 +249,9 @@
               <w:jc w:val="center"/>
             </w:pPr>
             <w:r>
+              <w:rPr>
+                <w:noProof/>
+              </w:rPr>
               <w:drawing>
                 <wp:inline distT="0" distB="0" distL="0" distR="0" wp14:anchorId="04898122" wp14:editId="1B69C154">
                   <wp:extent cx="1515600" cy="2332800"/>
@@ -323,6 +314,9 @@
               <w:jc w:val="center"/>
             </w:pPr>
             <w:r>
+              <w:rPr>
+                <w:noProof/>
+              </w:rPr>
               <w:drawing>
                 <wp:inline distT="0" distB="0" distL="0" distR="0" wp14:anchorId="4CC92147" wp14:editId="1930DF4A">
                   <wp:extent cx="1519200" cy="2332800"/>
@@ -385,6 +379,9 @@
               <w:jc w:val="center"/>
             </w:pPr>
             <w:r>
+              <w:rPr>
+                <w:noProof/>
+              </w:rPr>
               <w:drawing>
                 <wp:inline distT="0" distB="0" distL="0" distR="0" wp14:anchorId="2477F428" wp14:editId="55D76979">
                   <wp:extent cx="1526400" cy="2332800"/>
@@ -447,6 +444,9 @@
               <w:jc w:val="center"/>
             </w:pPr>
             <w:r>
+              <w:rPr>
+                <w:noProof/>
+              </w:rPr>
               <w:drawing>
                 <wp:inline distT="0" distB="0" distL="0" distR="0" wp14:anchorId="72CF70FE" wp14:editId="0537E2D0">
                   <wp:extent cx="1526400" cy="2332800"/>
@@ -520,6 +520,9 @@
               <w:jc w:val="center"/>
             </w:pPr>
             <w:r>
+              <w:rPr>
+                <w:noProof/>
+              </w:rPr>
               <w:drawing>
                 <wp:inline distT="0" distB="0" distL="0" distR="0" wp14:anchorId="3874B14E" wp14:editId="385FDAE0">
                   <wp:extent cx="1504800" cy="2332800"/>
@@ -582,6 +585,9 @@
               <w:jc w:val="center"/>
             </w:pPr>
             <w:r>
+              <w:rPr>
+                <w:noProof/>
+              </w:rPr>
               <w:drawing>
                 <wp:inline distT="0" distB="0" distL="0" distR="0" wp14:anchorId="65E06B80" wp14:editId="329965BC">
                   <wp:extent cx="1501200" cy="2332800"/>
@@ -644,6 +650,9 @@
               <w:jc w:val="center"/>
             </w:pPr>
             <w:r>
+              <w:rPr>
+                <w:noProof/>
+              </w:rPr>
               <w:drawing>
                 <wp:inline distT="0" distB="0" distL="0" distR="0" wp14:anchorId="75D0A181" wp14:editId="51CA037E">
                   <wp:extent cx="1497600" cy="2332800"/>
@@ -706,6 +715,9 @@
               <w:jc w:val="center"/>
             </w:pPr>
             <w:r>
+              <w:rPr>
+                <w:noProof/>
+              </w:rPr>
               <w:drawing>
                 <wp:inline distT="0" distB="0" distL="0" distR="0" wp14:anchorId="114172C6" wp14:editId="3EC86680">
                   <wp:extent cx="1587600" cy="2332800"/>
@@ -779,6 +791,9 @@
               <w:jc w:val="center"/>
             </w:pPr>
             <w:r>
+              <w:rPr>
+                <w:noProof/>
+              </w:rPr>
               <w:drawing>
                 <wp:inline distT="0" distB="0" distL="0" distR="0" wp14:anchorId="386D53A2" wp14:editId="64CC5EAA">
                   <wp:extent cx="1497600" cy="2332800"/>
@@ -841,6 +856,9 @@
               <w:jc w:val="center"/>
             </w:pPr>
             <w:r>
+              <w:rPr>
+                <w:noProof/>
+              </w:rPr>
               <w:drawing>
                 <wp:inline distT="0" distB="0" distL="0" distR="0" wp14:anchorId="0663C211" wp14:editId="61116F01">
                   <wp:extent cx="1497600" cy="2332800"/>
@@ -1585,6 +1603,7 @@
   <w:style w:type="character" w:default="1" w:styleId="Policepardfaut">
     <w:name w:val="Default Paragraph Font"/>
     <w:uiPriority w:val="1"/>
+    <w:semiHidden/>
     <w:unhideWhenUsed/>
   </w:style>
   <w:style w:type="table" w:default="1" w:styleId="TableauNormal">

</xml_diff>